<commit_message>
feat: upgrade to 5-stage goal-oriented daily loop, PDF generator, and CSV database
</commit_message>
<xml_diff>
--- a/Resume.docx
+++ b/Resume.docx
@@ -297,7 +297,7 @@
           <w:sz w:val="18"/>
           <w:szCs w:val="16"/>
         </w:rPr>
-        <w:t xml:space="preserve">Data Engineer with 3.6 years of experience designing and modernizing complex data ecosystems in </w:t>
+        <w:t xml:space="preserve">Data Engineer with 3.8 years of experience designing and modernizing complex data ecosystems in </w:t>
       </w:r>
       <w:r>
         <w:rPr>
@@ -377,9 +377,11 @@
       </w:r>
       <w:r>
         <w:rPr>
-          <w:rFonts w:ascii="Times New Roman" w:hAnsi="Times New Roman" w:cs="Times New Roman"/>
+          <w:rFonts w:ascii="Times New Roman" w:hAnsi="Times New Roman" w:eastAsia="Times New Roman" w:cs="Times New Roman"/>
+          <w:color w:val="000000"/>
           <w:sz w:val="18"/>
-          <w:szCs w:val="16"/>
+          <w:szCs w:val="18"/>
+          <w:highlight w:val="none"/>
         </w:rPr>
       </w:r>
       <w:r>
@@ -419,11 +421,9 @@
       </w:r>
       <w:r>
         <w:rPr>
-          <w:rFonts w:ascii="Times New Roman" w:hAnsi="Times New Roman" w:eastAsia="Times New Roman" w:cs="Times New Roman"/>
-          <w:color w:val="000000"/>
+          <w:rFonts w:ascii="Times New Roman" w:hAnsi="Times New Roman" w:cs="Times New Roman"/>
           <w:sz w:val="18"/>
-          <w:szCs w:val="16"/>
-          <w:highlight w:val="none"/>
+          <w:szCs w:val="18"/>
         </w:rPr>
       </w:r>
       <w:r>
@@ -2801,11 +2801,10 @@
       </w:r>
       <w:r>
         <w:rPr>
-          <w:rFonts w:ascii="Times New Roman" w:hAnsi="Times New Roman" w:eastAsia="Times New Roman" w:cs="Times New Roman"/>
+          <w:rFonts w:ascii="Times New Roman" w:hAnsi="Times New Roman" w:cs="Times New Roman"/>
           <w:color w:val="262626" w:themeColor="text1" w:themeTint="D9"/>
           <w:sz w:val="18"/>
           <w:szCs w:val="18"/>
-          <w:highlight w:val="none"/>
         </w:rPr>
       </w:r>
       <w:r>
@@ -3004,11 +3003,9 @@
       </w:r>
       <w:r>
         <w:rPr>
-          <w:rFonts w:ascii="Times New Roman" w:hAnsi="Times New Roman" w:eastAsia="Times New Roman" w:cs="Times New Roman"/>
-          <w:color w:val="000000"/>
+          <w:rFonts w:ascii="Times New Roman" w:hAnsi="Times New Roman" w:cs="Times New Roman"/>
           <w:sz w:val="18"/>
-          <w:szCs w:val="16"/>
-          <w:highlight w:val="none"/>
+          <w:szCs w:val="18"/>
         </w:rPr>
       </w:r>
       <w:r>

</xml_diff>